<commit_message>
docs: rewrite cover letter for i-JMR R1 resubmission
The cover letter was stale (JMIR Medical Informatics, ms#91493,
Decision E2, March 2026, length-reduction summary). Rewrite for the
current state: Interactive Journal of Medical Research, ms#96541,
Decision D (major revision), June 2026, summarizing the R1 revisions
that answer the editor and Reviewers Q and T. Rebuild cover-letter.docx
(reference.docx template) and cover-letter.pdf (tectonic), and refresh
the copies in ARCHIVED/20260615_IJMR-Submission.

Co-Authored-By: Claude Fable 5 <noreply@anthropic.com>
</commit_message>
<xml_diff>
--- a/ARCHIVED/20260615_IJMR-Submission/cover-letter.docx
+++ b/ARCHIVED/20260615_IJMR-Submission/cover-letter.docx
@@ -7,7 +7,7 @@
         <w:pStyle w:val="Date"/>
       </w:pPr>
       <w:r>
-        <w:t xml:space="preserve">March 2026</w:t>
+        <w:t xml:space="preserve">June 2026</w:t>
       </w:r>
     </w:p>
     <w:p>
@@ -15,7 +15,7 @@
         <w:pStyle w:val="FirstParagraph"/>
       </w:pPr>
       <w:r>
-        <w:t xml:space="preserve">Dear Editor,</w:t>
+        <w:t xml:space="preserve">Dear Dr. Balcarras,</w:t>
       </w:r>
     </w:p>
     <w:p>
@@ -35,7 +35,7 @@
         <w:t xml:space="preserve"> </w:t>
       </w:r>
       <w:r>
-        <w:t xml:space="preserve">(ms#91493) for consideration as a</w:t>
+        <w:t xml:space="preserve">(ms#96541) as a</w:t>
       </w:r>
       <w:r>
         <w:t xml:space="preserve"> </w:t>
@@ -51,16 +51,16 @@
         <w:t xml:space="preserve"> </w:t>
       </w:r>
       <w:r>
-        <w:t xml:space="preserve">article in JMIR Medical Informatics.</w:t>
-      </w:r>
-    </w:p>
-    <w:bookmarkStart w:id="9" w:name="response-to-decision-e2"/>
+        <w:t xml:space="preserve">article, revised in response to Decision D (major revision and re-review).</w:t>
+      </w:r>
+    </w:p>
+    <w:bookmarkStart w:id="9" w:name="response-to-decision-d"/>
     <w:p>
       <w:pPr>
         <w:pStyle w:val="Heading2"/>
       </w:pPr>
       <w:r>
-        <w:t xml:space="preserve">Response to Decision E2</w:t>
+        <w:t xml:space="preserve">Response to Decision D</w:t>
       </w:r>
     </w:p>
     <w:p>
@@ -68,19 +68,7 @@
         <w:pStyle w:val="FirstParagraph"/>
       </w:pPr>
       <w:r>
-        <w:t xml:space="preserve">I appreciate the editor’s feedback that the work is</w:t>
-      </w:r>
-      <w:r>
-        <w:t xml:space="preserve"> </w:t>
-      </w:r>
-      <w:r>
-        <w:t xml:space="preserve">“interesting”</w:t>
-      </w:r>
-      <w:r>
-        <w:t xml:space="preserve"> </w:t>
-      </w:r>
-      <w:r>
-        <w:t xml:space="preserve">and the invitation to resubmit after addressing the length concern and submission type.</w:t>
+        <w:t xml:space="preserve">I am grateful to you and to the two external reviewers for the constructive and detailed assessment. The reviews materially strengthened the manuscript, and I have addressed every editorial and reviewer comment. A full point-by-point response accompanies this resubmission; the summary below highlights the principal changes.</w:t>
       </w:r>
     </w:p>
     <w:bookmarkEnd w:id="9"/>
@@ -96,21 +84,13 @@
     <w:p>
       <w:pPr>
         <w:pStyle w:val="FirstParagraph"/>
-      </w:pPr>
-      <w:r>
-        <w:t xml:space="preserve">The manuscript has been revised to meet Viewpoint article requirements:</w:t>
-      </w:r>
-    </w:p>
-    <w:p>
-      <w:pPr>
-        <w:pStyle w:val="BodyText"/>
       </w:pPr>
       <w:r>
         <w:rPr>
           <w:i/>
           <w:iCs/>
         </w:rPr>
-        <w:t xml:space="preserve">Structural changes:</w:t>
+        <w:t xml:space="preserve">Engagement with recent literature and evidence (Editor; Reviewer Q3):</w:t>
       </w:r>
     </w:p>
     <w:p>
@@ -122,7 +102,7 @@
         </w:numPr>
       </w:pPr>
       <w:r>
-        <w:t xml:space="preserve">Reduced to approximately 4,600 body words (within the 5,000-word limit)</w:t>
+        <w:t xml:space="preserve">Added empirical evidence that human oversight measurably improves AI-generated analytics, including a prospective study in which human-verified large-language-model output exceeded a human-only workflow, and a text-to-SQL validation gate that improved semantic correctness.</w:t>
       </w:r>
     </w:p>
     <w:p>
@@ -134,7 +114,7 @@
         </w:numPr>
       </w:pPr>
       <w:r>
-        <w:t xml:space="preserve">Converted from IMRD structure (Introduction, Methods, Results, Discussion) to descriptive thematic headers appropriate for Viewpoint articles</w:t>
+        <w:t xml:space="preserve">Added database query-log evidence on query reuse and diversity to address the scope and practicality of the framework.</w:t>
       </w:r>
     </w:p>
     <w:p>
@@ -146,7 +126,7 @@
         </w:numPr>
       </w:pPr>
       <w:r>
-        <w:t xml:space="preserve">Converted the structured abstract to an unstructured flowing narrative (302 words)</w:t>
+        <w:t xml:space="preserve">In total, 14 references spanning 1994-2026 were added, the majority from 2016-2026.</w:t>
       </w:r>
     </w:p>
     <w:p>
@@ -158,15 +138,7 @@
           <w:i/>
           <w:iCs/>
         </w:rPr>
-        <w:t xml:space="preserve">Content focus:</w:t>
-      </w:r>
-    </w:p>
-    <w:p>
-      <w:pPr>
-        <w:pStyle w:val="BodyText"/>
-      </w:pPr>
-      <w:r>
-        <w:t xml:space="preserve">The revised manuscript retains the core intellectual contributions while removing the exhaustive methodology and literature review sections:</w:t>
+        <w:t xml:space="preserve">Conceptual clarity (Reviewer T1):</w:t>
       </w:r>
     </w:p>
     <w:p>
@@ -178,123 +150,19 @@
         </w:numPr>
       </w:pPr>
       <w:r>
+        <w:t xml:space="preserve">Added explicit, cited definitions of the three title constructs (analytics maturity, workforce agility, and technical enablement) at the head of each evidence pillar, grounded in the established literature.</w:t>
+      </w:r>
+    </w:p>
+    <w:p>
+      <w:pPr>
+        <w:pStyle w:val="FirstParagraph"/>
+      </w:pPr>
+      <w:r>
         <w:rPr>
           <w:i/>
           <w:iCs/>
         </w:rPr>
-        <w:t xml:space="preserve">Human-in-the-Loop Knowledge Governance (HITL-KG) framework:</w:t>
-      </w:r>
-      <w:r>
-        <w:t xml:space="preserve"> </w:t>
-      </w:r>
-      <w:r>
-        <w:t xml:space="preserve">The socio-technical architecture for converting tacit domain expertise into durable validated query triples</w:t>
-      </w:r>
-    </w:p>
-    <w:p>
-      <w:pPr>
-        <w:pStyle w:val="Compact"/>
-        <w:numPr>
-          <w:ilvl w:val="0"/>
-          <w:numId w:val="1002"/>
-        </w:numPr>
-      </w:pPr>
-      <w:r>
-        <w:rPr>
-          <w:i/>
-          <w:iCs/>
-        </w:rPr>
-        <w:t xml:space="preserve">Theoretical grounding in Nonaka’s SECI model:</w:t>
-      </w:r>
-      <w:r>
-        <w:t xml:space="preserve"> </w:t>
-      </w:r>
-      <w:r>
-        <w:t xml:space="preserve">Reinterpretation of knowledge creation theory for the unstable healthcare analytics workforce</w:t>
-      </w:r>
-    </w:p>
-    <w:p>
-      <w:pPr>
-        <w:pStyle w:val="Compact"/>
-        <w:numPr>
-          <w:ilvl w:val="0"/>
-          <w:numId w:val="1002"/>
-        </w:numPr>
-      </w:pPr>
-      <w:r>
-        <w:rPr>
-          <w:i/>
-          <w:iCs/>
-        </w:rPr>
-        <w:t xml:space="preserve">The Validator Paradox:</w:t>
-      </w:r>
-      <w:r>
-        <w:t xml:space="preserve"> </w:t>
-      </w:r>
-      <w:r>
-        <w:t xml:space="preserve">Intellectually honest engagement with the circular objection to the framework, resolved through Lean</w:t>
-      </w:r>
-      <w:r>
-        <w:t xml:space="preserve"> </w:t>
-      </w:r>
-      <w:r>
-        <w:t xml:space="preserve">“Standard Work”</w:t>
-      </w:r>
-    </w:p>
-    <w:p>
-      <w:pPr>
-        <w:pStyle w:val="Compact"/>
-        <w:numPr>
-          <w:ilvl w:val="0"/>
-          <w:numId w:val="1002"/>
-        </w:numPr>
-      </w:pPr>
-      <w:r>
-        <w:rPr>
-          <w:i/>
-          <w:iCs/>
-        </w:rPr>
-        <w:t xml:space="preserve">Three-Pillar Assessment Rubric:</w:t>
-      </w:r>
-      <w:r>
-        <w:t xml:space="preserve"> </w:t>
-      </w:r>
-      <w:r>
-        <w:t xml:space="preserve">A structured self-assessment tool with evidence-based indicators across analytics maturity, workforce agility, and technical enablement</w:t>
-      </w:r>
-    </w:p>
-    <w:p>
-      <w:pPr>
-        <w:pStyle w:val="Compact"/>
-        <w:numPr>
-          <w:ilvl w:val="0"/>
-          <w:numId w:val="1002"/>
-        </w:numPr>
-      </w:pPr>
-      <w:r>
-        <w:rPr>
-          <w:i/>
-          <w:iCs/>
-        </w:rPr>
-        <w:t xml:space="preserve">Three pillars of evidence:</w:t>
-      </w:r>
-      <w:r>
-        <w:t xml:space="preserve"> </w:t>
-      </w:r>
-      <w:r>
-        <w:t xml:space="preserve">Synthesized evidence on analytics maturity, workforce agility, and technical enablement</w:t>
-      </w:r>
-    </w:p>
-    <w:p>
-      <w:pPr>
-        <w:pStyle w:val="FirstParagraph"/>
-      </w:pPr>
-      <w:r>
-        <w:rPr>
-          <w:i/>
-          <w:iCs/>
-        </w:rPr>
-        <w:t xml:space="preserve">Quality assurance:</w:t>
+        <w:t xml:space="preserve">Methodological caveats (Reviewer Q1, Q4):</w:t>
       </w:r>
     </w:p>
     <w:p>
@@ -306,7 +174,7 @@
         </w:numPr>
       </w:pPr>
       <w:r>
-        <w:t xml:space="preserve">All citations updated to 2024-2026 data where available</w:t>
+        <w:t xml:space="preserve">Added a self-selection-bias caveat to the analytics-maturity evidence, grounded in the organizational-survey methodology literature.</w:t>
       </w:r>
     </w:p>
     <w:p>
@@ -318,7 +186,19 @@
         </w:numPr>
       </w:pPr>
       <w:r>
-        <w:t xml:space="preserve">Framework advances a prescriptive Viewpoint position grounded in descriptive evidence; conversational AI framed as enabler, not solution</w:t>
+        <w:t xml:space="preserve">Added a Limitations paragraph acknowledging that the framework complements, rather than replaces, investment in workforce training and analytics literacy.</w:t>
+      </w:r>
+    </w:p>
+    <w:p>
+      <w:pPr>
+        <w:pStyle w:val="FirstParagraph"/>
+      </w:pPr>
+      <w:r>
+        <w:rPr>
+          <w:i/>
+          <w:iCs/>
+        </w:rPr>
+        <w:t xml:space="preserve">Currency and consolidation (Reviewer Q6; Reviewer T2, T4):</w:t>
       </w:r>
     </w:p>
     <w:p>
@@ -326,21 +206,23 @@
         <w:pStyle w:val="Compact"/>
         <w:numPr>
           <w:ilvl w:val="0"/>
-          <w:numId w:val="1003"/>
+          <w:numId w:val="1004"/>
         </w:numPr>
       </w:pPr>
       <w:r>
-        <w:t xml:space="preserve">Competing interests disclosed per JMIR requirements</w:t>
-      </w:r>
-    </w:p>
-    <w:bookmarkEnd w:id="10"/>
-    <w:bookmarkStart w:id="11" w:name="article-type"/>
-    <w:p>
-      <w:pPr>
-        <w:pStyle w:val="Heading2"/>
-      </w:pPr>
-      <w:r>
-        <w:t xml:space="preserve">Article Type</w:t>
+        <w:t xml:space="preserve">Replaced aging workforce statistics with contemporary (2021-2025) evidence; the single remaining two-decade-old reference is now framed explicitly as a historical benchmark.</w:t>
+      </w:r>
+    </w:p>
+    <w:p>
+      <w:pPr>
+        <w:pStyle w:val="Compact"/>
+        <w:numPr>
+          <w:ilvl w:val="0"/>
+          <w:numId w:val="1004"/>
+        </w:numPr>
+      </w:pPr>
+      <w:r>
+        <w:t xml:space="preserve">Consolidated duplicated turnover statistics to a single mention.</w:t>
       </w:r>
     </w:p>
     <w:p>
@@ -348,7 +230,91 @@
         <w:pStyle w:val="FirstParagraph"/>
       </w:pPr>
       <w:r>
-        <w:t xml:space="preserve">This submission is a</w:t>
+        <w:rPr>
+          <w:i/>
+          <w:iCs/>
+        </w:rPr>
+        <w:t xml:space="preserve">Figure revision (Reviewer T3):</w:t>
+      </w:r>
+    </w:p>
+    <w:p>
+      <w:pPr>
+        <w:pStyle w:val="Compact"/>
+        <w:numPr>
+          <w:ilvl w:val="0"/>
+          <w:numId w:val="1005"/>
+        </w:numPr>
+      </w:pPr>
+      <w:r>
+        <w:t xml:space="preserve">Revised Figure 1 to add a feedback edge from Organizational Memory to the Knowledge Base, depicting continuous learning rather than a static knowledge base.</w:t>
+      </w:r>
+    </w:p>
+    <w:p>
+      <w:pPr>
+        <w:pStyle w:val="FirstParagraph"/>
+      </w:pPr>
+      <w:r>
+        <w:rPr>
+          <w:i/>
+          <w:iCs/>
+        </w:rPr>
+        <w:t xml:space="preserve">Formatting and compliance (Editor):</w:t>
+      </w:r>
+    </w:p>
+    <w:p>
+      <w:pPr>
+        <w:pStyle w:val="Compact"/>
+        <w:numPr>
+          <w:ilvl w:val="0"/>
+          <w:numId w:val="1006"/>
+        </w:numPr>
+      </w:pPr>
+      <w:r>
+        <w:t xml:space="preserve">Converted all in-text citations to numbered square brackets.</w:t>
+      </w:r>
+    </w:p>
+    <w:p>
+      <w:pPr>
+        <w:pStyle w:val="Compact"/>
+        <w:numPr>
+          <w:ilvl w:val="0"/>
+          <w:numId w:val="1006"/>
+        </w:numPr>
+      </w:pPr>
+      <w:r>
+        <w:t xml:space="preserve">Removed heading numbering and the italic sub-table titles that stood in place of subheadings.</w:t>
+      </w:r>
+    </w:p>
+    <w:p>
+      <w:pPr>
+        <w:pStyle w:val="Compact"/>
+        <w:numPr>
+          <w:ilvl w:val="0"/>
+          <w:numId w:val="1006"/>
+        </w:numPr>
+      </w:pPr>
+      <w:r>
+        <w:t xml:space="preserve">Added a Funding statement distinct from the Acknowledgments, and a generative-AI disclosure within the manuscript.</w:t>
+      </w:r>
+    </w:p>
+    <w:p>
+      <w:pPr>
+        <w:pStyle w:val="Compact"/>
+        <w:numPr>
+          <w:ilvl w:val="0"/>
+          <w:numId w:val="1006"/>
+        </w:numPr>
+      </w:pPr>
+      <w:r>
+        <w:t xml:space="preserve">Completed all reference details (volume, issue, pages, DOI) and the Abbreviations list, with acronyms defined at first use.</w:t>
+      </w:r>
+    </w:p>
+    <w:p>
+      <w:pPr>
+        <w:pStyle w:val="FirstParagraph"/>
+      </w:pPr>
+      <w:r>
+        <w:t xml:space="preserve">The revised manuscript remains a</w:t>
       </w:r>
       <w:r>
         <w:t xml:space="preserve"> </w:t>
@@ -364,7 +330,41 @@
         <w:t xml:space="preserve"> </w:t>
       </w:r>
       <w:r>
-        <w:t xml:space="preserve">article: an evidence-based scholarly perspective on mitigating institutional amnesia in healthcare analytics, grounded in peer-reviewed literature and knowledge management theory.</w:t>
+        <w:t xml:space="preserve">of 4,532 body words (within the 5,000-word limit) with an unstructured abstract of 304 words.</w:t>
+      </w:r>
+    </w:p>
+    <w:bookmarkEnd w:id="10"/>
+    <w:bookmarkStart w:id="11" w:name="article-type"/>
+    <w:p>
+      <w:pPr>
+        <w:pStyle w:val="Heading2"/>
+      </w:pPr>
+      <w:r>
+        <w:t xml:space="preserve">Article Type</w:t>
+      </w:r>
+    </w:p>
+    <w:p>
+      <w:pPr>
+        <w:pStyle w:val="FirstParagraph"/>
+      </w:pPr>
+      <w:r>
+        <w:t xml:space="preserve">This submission is a</w:t>
+      </w:r>
+      <w:r>
+        <w:t xml:space="preserve"> </w:t>
+      </w:r>
+      <w:r>
+        <w:rPr>
+          <w:i/>
+          <w:iCs/>
+        </w:rPr>
+        <w:t xml:space="preserve">Viewpoint</w:t>
+      </w:r>
+      <w:r>
+        <w:t xml:space="preserve"> </w:t>
+      </w:r>
+      <w:r>
+        <w:t xml:space="preserve">article: an evidence-based scholarly perspective on mitigating institutional amnesia in healthcare analytics, grounded in peer-reviewed literature and knowledge management theory. As the Viewpoint article type does not permit IMRD section headings, descriptive thematic headers are used throughout, as detailed in the point-by-point response.</w:t>
       </w:r>
     </w:p>
     <w:p>
@@ -627,6 +627,15 @@
     <w:abstractNumId w:val="991"/>
   </w:num>
   <w:num w:numId="1003">
+    <w:abstractNumId w:val="991"/>
+  </w:num>
+  <w:num w:numId="1004">
+    <w:abstractNumId w:val="991"/>
+  </w:num>
+  <w:num w:numId="1005">
+    <w:abstractNumId w:val="991"/>
+  </w:num>
+  <w:num w:numId="1006">
     <w:abstractNumId w:val="991"/>
   </w:num>
 </w:numbering>

</xml_diff>

<commit_message>
docs: add dated letterhead block to cover letter
Add a visible letterhead (sender, date, recipient, RE line) above the
salutation so the rendered cover-letter.docx/pdf show the date and
addressee rather than opening at 'Dear Dr. Balcarras'. Rebuild both
formats and refresh the archive copies.

Co-Authored-By: Claude Fable 5 <noreply@anthropic.com>
</commit_message>
<xml_diff>
--- a/ARCHIVED/20260615_IJMR-Submission/cover-letter.docx
+++ b/ARCHIVED/20260615_IJMR-Submission/cover-letter.docx
@@ -13,6 +13,62 @@
     <w:p>
       <w:pPr>
         <w:pStyle w:val="FirstParagraph"/>
+      </w:pPr>
+      <w:r>
+        <w:t xml:space="preserve">Samuel T Harrold</w:t>
+      </w:r>
+      <w:r>
+        <w:br/>
+      </w:r>
+      <w:r>
+        <w:t xml:space="preserve">Yuimedi, Inc.</w:t>
+      </w:r>
+      <w:r>
+        <w:br/>
+      </w:r>
+      <w:r>
+        <w:t xml:space="preserve">samuel.harrold@yuimedi.com</w:t>
+      </w:r>
+    </w:p>
+    <w:p>
+      <w:pPr>
+        <w:pStyle w:val="BodyText"/>
+      </w:pPr>
+      <w:r>
+        <w:t xml:space="preserve">June 2026</w:t>
+      </w:r>
+    </w:p>
+    <w:p>
+      <w:pPr>
+        <w:pStyle w:val="BodyText"/>
+      </w:pPr>
+      <w:r>
+        <w:t xml:space="preserve">Dr. Matthew Balcarras</w:t>
+      </w:r>
+      <w:r>
+        <w:br/>
+      </w:r>
+      <w:r>
+        <w:t xml:space="preserve">Editor, Interactive Journal of Medical Research</w:t>
+      </w:r>
+      <w:r>
+        <w:br/>
+      </w:r>
+      <w:r>
+        <w:t xml:space="preserve">JMIR Publications</w:t>
+      </w:r>
+    </w:p>
+    <w:p>
+      <w:pPr>
+        <w:pStyle w:val="BodyText"/>
+      </w:pPr>
+      <w:r>
+        <w:t xml:space="preserve">RE: Revised Manuscript (R1) Resubmission: ms#96541, Decision D (major revision and re-review)</w:t>
+      </w:r>
+    </w:p>
+    <w:p>
+      <w:pPr>
+        <w:pStyle w:val="BodyText"/>
       </w:pPr>
       <w:r>
         <w:t xml:space="preserve">Dear Dr. Balcarras,</w:t>

</xml_diff>